<commit_message>
Fix memory leaks and identify the ATC 2.1.9 candidate
Close user-function directory streams, guard base-prefix lookbehind, and
remove overlapping expression appends. Preserve complex root/log arguments,
small nonzero components and exact power axes.

Align runtime, Windows resources, integration, documentation and candidate
distribution definitions with 2.1.9; retain historical release evidence.
Remove focused-runner executable copies after use.

Validation: Linux GCC Release and ASan/UBSan 128/128 each. Native LSan
128/128 plus focused groups 58/58, 44/44, 160/160 and 50/50, with valid
thread inspection and no diagnostics in tested paths. Version consistency
and git diff --check pass. Windows x64, Win32 and XP x86 validation remain
pending for this final candidate. No installers or release were produced.
</commit_message>
<xml_diff>
--- a/docs/docx/ATC_Full_User_Guide_EN.docx
+++ b/docs/docx/ATC_Full_User_Guide_EN.docx
@@ -11,13 +11,16 @@
       </w:r>
     </w:p>
     <w:p>
-      <w:r>
-        <w:t>﻿# Advanced Trigonometry Calculator Full User Guide</w:t>
-      </w:r>
-    </w:p>
-    <w:p>
-      <w:r>
-        <w:t>Version: ATC 2.1.7</w:t>
+      <w:pPr>
+        <w:pStyle w:val="Heading1"/>
+      </w:pPr>
+      <w:r>
+        <w:t>Advanced Trigonometry Calculator Full User Guide</w:t>
+      </w:r>
+    </w:p>
+    <w:p>
+      <w:r>
+        <w:t>Version: ATC 2.1.9</w:t>
       </w:r>
     </w:p>
     <w:p>
@@ -37,12 +40,12 @@
     </w:p>
     <w:p>
       <w:r>
-        <w:t>Calculator (ATC). It is based on the existing online user guide, the current</w:t>
-      </w:r>
-    </w:p>
-    <w:p>
-      <w:r>
-        <w:t>2.1.7 documentation, and the automated regression coverage available in this</w:t>
+        <w:t>Calculator (ATC). It is based on the existing online user guide, the 2.1.8 documentation and subsequent</w:t>
+      </w:r>
+    </w:p>
+    <w:p>
+      <w:r>
+        <w:t>2.1.9 updates, and the automated regression coverage available in this</w:t>
       </w:r>
     </w:p>
     <w:p>
@@ -534,7 +537,7 @@
     </w:p>
     <w:p>
       <w:r>
-        <w:t>ATC 2.1.7 includes a custom prompt editor:</w:t>
+        <w:t>ATC 2.1.9 includes a custom prompt editor:</w:t>
       </w:r>
     </w:p>
     <w:p>
@@ -669,7 +672,7 @@
     </w:p>
     <w:p>
       <w:r>
-        <w:t>ATC 2.1.7 supports:</w:t>
+        <w:t>ATC 2.1.9 supports:</w:t>
       </w:r>
     </w:p>
     <w:p>
@@ -1254,7 +1257,7 @@
     </w:p>
     <w:p>
       <w:r>
-        <w:t>ATC 2.1.7 accepts broader variable names than older parser versions while</w:t>
+        <w:t>ATC 2.1.9 accepts broader variable names than older parser versions while</w:t>
       </w:r>
     </w:p>
     <w:p>
@@ -1734,7 +1737,22 @@
     </w:p>
     <w:p>
       <w:r>
-        <w:t>fast-path normalizations.</w:t>
+        <w:t>fast-path normalizations. ATC 2.1.9 validates each candidate against the</w:t>
+      </w:r>
+    </w:p>
+    <w:p>
+      <w:r>
+        <w:t>original expression before returning it. A solution may be real or complex.</w:t>
+      </w:r>
+    </w:p>
+    <w:p>
+      <w:r>
+        <w:t>If the earlier solver path does not produce a valid root, a general numerical</w:t>
+      </w:r>
+    </w:p>
+    <w:p>
+      <w:r>
+        <w:t>fallback is attempted.</w:t>
       </w:r>
     </w:p>
     <w:p>
@@ -1770,6 +1788,36 @@
         <w:t>solver(((x-5)(x+2))/(x-5))</w:t>
         <w:br/>
         <w:t>solver((x-e+pii)(x-e-pii))</w:t>
+        <w:br/>
+        <w:t>solver(x^2-2)</w:t>
+        <w:br/>
+        <w:t>solver(x^2+1)</w:t>
+        <w:br/>
+        <w:t>solver(x^2-2i)</w:t>
+        <w:br/>
+        <w:t>solver(x^2+22)</w:t>
+      </w:r>
+    </w:p>
+    <w:p>
+      <w:r>
+        <w:t>The last four examples cover validated real and complex polynomial roots. When</w:t>
+      </w:r>
+    </w:p>
+    <w:p>
+      <w:r>
+        <w:t>no candidate satisfies the original expression, ATC reports:</w:t>
+      </w:r>
+    </w:p>
+    <w:p>
+      <w:pPr>
+        <w:pStyle w:val="NoSpacing"/>
+      </w:pPr>
+      <w:r>
+        <w:rPr>
+          <w:rFonts w:ascii="Consolas" w:hAnsi="Consolas"/>
+          <w:sz w:val="18"/>
+        </w:rPr>
+        <w:t>ATC was unable to find a valid solution.</w:t>
       </w:r>
     </w:p>
     <w:p>
@@ -2606,19 +2654,15 @@
     </w:p>
     <w:p>
       <w:r>
-        <w:t>The dedicated cookbook is available at:</w:t>
-      </w:r>
-    </w:p>
-    <w:p>
-      <w:pPr>
-        <w:pStyle w:val="NoSpacing"/>
-      </w:pPr>
-      <w:r>
-        <w:rPr>
-          <w:rFonts w:ascii="Consolas" w:hAnsi="Consolas"/>
-          <w:sz w:val="18"/>
-        </w:rPr>
-        <w:t>docs/en/ATC_Cookbook.md</w:t>
+        <w:t>Online project documentation:</w:t>
+      </w:r>
+    </w:p>
+    <w:p>
+      <w:pPr>
+        <w:pStyle w:val="ListBullet"/>
+      </w:pPr>
+      <w:r>
+        <w:t>ATC Cookbook</w:t>
       </w:r>
     </w:p>
     <w:p>
@@ -2786,7 +2830,135 @@
     </w:p>
     <w:p>
       <w:r>
-        <w:t>The dedicated best-practices guide is available at:</w:t>
+        <w:t>Online project documentation:</w:t>
+      </w:r>
+    </w:p>
+    <w:p>
+      <w:pPr>
+        <w:pStyle w:val="ListBullet"/>
+      </w:pPr>
+      <w:r>
+        <w:t>ATC Best Practices</w:t>
+      </w:r>
+    </w:p>
+    <w:p>
+      <w:r>
+        <w:t>Use it for reliable day-to-day workflows: start with small expressions,</w:t>
+      </w:r>
+    </w:p>
+    <w:p>
+      <w:r>
+        <w:t>confirm angle mode, validate parentheses, choose the right solver path, use TXT</w:t>
+      </w:r>
+    </w:p>
+    <w:p>
+      <w:r>
+        <w:t>files for repeatable batches and avoid undocumented behavior.</w:t>
+      </w:r>
+    </w:p>
+    <w:p>
+      <w:pPr>
+        <w:pStyle w:val="Heading2"/>
+      </w:pPr>
+      <w:r>
+        <w:t>38. Practical troubleshooting</w:t>
+      </w:r>
+    </w:p>
+    <w:p>
+      <w:r>
+        <w:t>If an expression fails:</w:t>
+      </w:r>
+    </w:p>
+    <w:p>
+      <w:pPr>
+        <w:pStyle w:val="ListBullet"/>
+      </w:pPr>
+      <w:r>
+        <w:t>check parentheses balance;</w:t>
+      </w:r>
+    </w:p>
+    <w:p>
+      <w:pPr>
+        <w:pStyle w:val="ListBullet"/>
+      </w:pPr>
+      <w:r>
+        <w:t>check angle mode;</w:t>
+      </w:r>
+    </w:p>
+    <w:p>
+      <w:pPr>
+        <w:pStyle w:val="ListBullet"/>
+      </w:pPr>
+      <w:r>
+        <w:t>check whether _ is needed for negative input;</w:t>
+      </w:r>
+    </w:p>
+    <w:p>
+      <w:pPr>
+        <w:pStyle w:val="ListBullet"/>
+      </w:pPr>
+      <w:r>
+        <w:t>check whether the command is interactive;</w:t>
+      </w:r>
+    </w:p>
+    <w:p>
+      <w:pPr>
+        <w:pStyle w:val="ListBullet"/>
+      </w:pPr>
+      <w:r>
+        <w:t>simplify the expression and test smaller pieces;</w:t>
+      </w:r>
+    </w:p>
+    <w:p>
+      <w:pPr>
+        <w:pStyle w:val="ListBullet"/>
+      </w:pPr>
+      <w:r>
+        <w:t>use verbose resolution(1) for a more detailed trace;</w:t>
+      </w:r>
+    </w:p>
+    <w:p>
+      <w:pPr>
+        <w:pStyle w:val="ListBullet"/>
+      </w:pPr>
+      <w:r>
+        <w:t>confirm whether the feature is documented and covered by regression tests.</w:t>
+      </w:r>
+    </w:p>
+    <w:p>
+      <w:pPr>
+        <w:pStyle w:val="Heading2"/>
+      </w:pPr>
+      <w:r>
+        <w:t>39. Documentation and test coverage</w:t>
+      </w:r>
+    </w:p>
+    <w:p>
+      <w:r>
+        <w:t>Online project documentation:</w:t>
+      </w:r>
+    </w:p>
+    <w:p>
+      <w:pPr>
+        <w:pStyle w:val="ListBullet"/>
+      </w:pPr>
+      <w:r>
+        <w:t>Testing</w:t>
+      </w:r>
+    </w:p>
+    <w:p>
+      <w:r>
+        <w:t>Historical validation recorded before the final 2.1.9 candidate:</w:t>
+      </w:r>
+    </w:p>
+    <w:p>
+      <w:r>
+        <w:t>These results do not approve the current candidate. Final validation must</w:t>
+      </w:r>
+    </w:p>
+    <w:p>
+      <w:r>
+        <w:t>identify the source snapshot and executable hashes.</w:t>
       </w:r>
     </w:p>
     <w:p>
@@ -2798,137 +2970,13 @@
           <w:rFonts w:ascii="Consolas" w:hAnsi="Consolas"/>
           <w:sz w:val="18"/>
         </w:rPr>
-        <w:t>docs/en/Best_Practices.md</w:t>
-      </w:r>
-    </w:p>
-    <w:p>
-      <w:r>
-        <w:t>Use it for reliable day-to-day workflows: start with small expressions,</w:t>
-      </w:r>
-    </w:p>
-    <w:p>
-      <w:r>
-        <w:t>confirm angle mode, validate parentheses, choose the right solver path, use TXT</w:t>
-      </w:r>
-    </w:p>
-    <w:p>
-      <w:r>
-        <w:t>files for repeatable batches and avoid undocumented behavior.</w:t>
-      </w:r>
-    </w:p>
-    <w:p>
-      <w:pPr>
-        <w:pStyle w:val="Heading2"/>
-      </w:pPr>
-      <w:r>
-        <w:t>38. Practical troubleshooting</w:t>
-      </w:r>
-    </w:p>
-    <w:p>
-      <w:r>
-        <w:t>If an expression fails:</w:t>
-      </w:r>
-    </w:p>
-    <w:p>
-      <w:pPr>
-        <w:pStyle w:val="ListBullet"/>
-      </w:pPr>
-      <w:r>
-        <w:t>check parentheses balance;</w:t>
-      </w:r>
-    </w:p>
-    <w:p>
-      <w:pPr>
-        <w:pStyle w:val="ListBullet"/>
-      </w:pPr>
-      <w:r>
-        <w:t>check angle mode;</w:t>
-      </w:r>
-    </w:p>
-    <w:p>
-      <w:pPr>
-        <w:pStyle w:val="ListBullet"/>
-      </w:pPr>
-      <w:r>
-        <w:t>check whether _ is needed for negative input;</w:t>
-      </w:r>
-    </w:p>
-    <w:p>
-      <w:pPr>
-        <w:pStyle w:val="ListBullet"/>
-      </w:pPr>
-      <w:r>
-        <w:t>check whether the command is interactive;</w:t>
-      </w:r>
-    </w:p>
-    <w:p>
-      <w:pPr>
-        <w:pStyle w:val="ListBullet"/>
-      </w:pPr>
-      <w:r>
-        <w:t>simplify the expression and test smaller pieces;</w:t>
-      </w:r>
-    </w:p>
-    <w:p>
-      <w:pPr>
-        <w:pStyle w:val="ListBullet"/>
-      </w:pPr>
-      <w:r>
-        <w:t>use verbose resolution(1) for a more detailed trace;</w:t>
-      </w:r>
-    </w:p>
-    <w:p>
-      <w:pPr>
-        <w:pStyle w:val="ListBullet"/>
-      </w:pPr>
-      <w:r>
-        <w:t>confirm whether the feature is documented and covered by regression tests.</w:t>
-      </w:r>
-    </w:p>
-    <w:p>
-      <w:pPr>
-        <w:pStyle w:val="Heading2"/>
-      </w:pPr>
-      <w:r>
-        <w:t>39. Documentation and test coverage</w:t>
-      </w:r>
-    </w:p>
-    <w:p>
-      <w:r>
-        <w:t>The repository includes:</w:t>
-      </w:r>
-    </w:p>
-    <w:p>
-      <w:pPr>
-        <w:pStyle w:val="NoSpacing"/>
-      </w:pPr>
-      <w:r>
-        <w:rPr>
-          <w:rFonts w:ascii="Consolas" w:hAnsi="Consolas"/>
-          <w:sz w:val="18"/>
-        </w:rPr>
-        <w:t>docs/Testing.md</w:t>
+        <w:t>All: 376 passed, 0 failed</w:t>
         <w:br/>
-        <w:t>tests/ATC_AUTOMATED_TEST_CASES.md</w:t>
+        <w:t>SolverComplex: 14 passed, 0 failed</w:t>
         <w:br/>
-        <w:t>tests/ATC_USER_GUIDE_COVERAGE.md</w:t>
-      </w:r>
-    </w:p>
-    <w:p>
-      <w:r>
-        <w:t>Current validated regression result:</w:t>
-      </w:r>
-    </w:p>
-    <w:p>
-      <w:pPr>
-        <w:pStyle w:val="NoSpacing"/>
-      </w:pPr>
-      <w:r>
-        <w:rPr>
-          <w:rFonts w:ascii="Consolas" w:hAnsi="Consolas"/>
-          <w:sz w:val="18"/>
-        </w:rPr>
-        <w:t>Summary: 359 passed, 0 failed</w:t>
+        <w:t>Txt: 15 passed, 0 failed</w:t>
+        <w:br/>
+        <w:t>Settings: 7 passed, 0 failed</w:t>
       </w:r>
     </w:p>
     <w:p>
@@ -2938,7 +2986,7 @@
     </w:p>
     <w:p>
       <w:r>
-        <w:t>2.1.7.</w:t>
+        <w:t>2.1.9.</w:t>
       </w:r>
     </w:p>
     <w:sectPr>
@@ -3381,7 +3429,7 @@
       <w:rFonts w:asciiTheme="majorHAnsi" w:eastAsiaTheme="majorEastAsia" w:hAnsiTheme="majorHAnsi" w:cstheme="majorBidi"/>
       <w:b/>
       <w:bCs/>
-      <w:color w:val="365F91" w:themeColor="accent1" w:themeShade="BF"/>
+      <w:color w:val="000000"/>
       <w:sz w:val="28"/>
       <w:szCs w:val="28"/>
     </w:rPr>
@@ -3405,7 +3453,7 @@
       <w:rFonts w:asciiTheme="majorHAnsi" w:eastAsiaTheme="majorEastAsia" w:hAnsiTheme="majorHAnsi" w:cstheme="majorBidi"/>
       <w:b/>
       <w:bCs/>
-      <w:color w:val="4F81BD" w:themeColor="accent1"/>
+      <w:color w:val="000000"/>
       <w:sz w:val="26"/>
       <w:szCs w:val="26"/>
     </w:rPr>
@@ -3429,7 +3477,7 @@
       <w:rFonts w:asciiTheme="majorHAnsi" w:eastAsiaTheme="majorEastAsia" w:hAnsiTheme="majorHAnsi" w:cstheme="majorBidi"/>
       <w:b/>
       <w:bCs/>
-      <w:color w:val="4F81BD" w:themeColor="accent1"/>
+      <w:color w:val="000000"/>
     </w:rPr>
   </w:style>
   <w:style w:type="paragraph" w:styleId="Heading4">
@@ -3454,7 +3502,7 @@
       <w:bCs/>
       <w:i/>
       <w:iCs/>
-      <w:color w:val="4F81BD" w:themeColor="accent1"/>
+      <w:color w:val="000000"/>
     </w:rPr>
   </w:style>
   <w:style w:type="paragraph" w:styleId="Heading5">
@@ -3660,15 +3708,12 @@
     <w:qFormat/>
     <w:rsid w:val="00FC693F"/>
     <w:pPr>
-      <w:pBdr>
-        <w:bottom w:val="single" w:sz="8" w:space="4" w:color="4F81BD" w:themeColor="accent1"/>
-      </w:pBdr>
       <w:spacing w:after="300" w:line="240" w:lineRule="auto"/>
       <w:contextualSpacing/>
     </w:pPr>
     <w:rPr>
       <w:rFonts w:asciiTheme="majorHAnsi" w:eastAsiaTheme="majorEastAsia" w:hAnsiTheme="majorHAnsi" w:cstheme="majorBidi"/>
-      <w:color w:val="17365D" w:themeColor="text2" w:themeShade="BF"/>
+      <w:color w:val="000000"/>
       <w:spacing w:val="5"/>
       <w:kern w:val="28"/>
       <w:sz w:val="52"/>
@@ -3707,7 +3752,7 @@
       <w:rFonts w:asciiTheme="majorHAnsi" w:eastAsiaTheme="majorEastAsia" w:hAnsiTheme="majorHAnsi" w:cstheme="majorBidi"/>
       <w:i/>
       <w:iCs/>
-      <w:color w:val="4F81BD" w:themeColor="accent1"/>
+      <w:color w:val="000000"/>
       <w:spacing w:val="15"/>
       <w:sz w:val="24"/>
       <w:szCs w:val="24"/>

</xml_diff>